<commit_message>
add final quy trinh van chuyen lien tinh
</commit_message>
<xml_diff>
--- a/02.FINAL_SPACE/FINAL_PROCESS/Quy trình tuyển dụng và đào tạo nhân sự/final/doc.docx
+++ b/02.FINAL_SPACE/FINAL_PROCESS/Quy trình tuyển dụng và đào tạo nhân sự/final/doc.docx
@@ -3308,7 +3308,14 @@
                 <w:sz w:val="19"/>
                 <w:szCs w:val="19"/>
               </w:rPr>
-              <w:t>Tuyển dụng và đào tạo thành công</w:t>
+              <w:t xml:space="preserve">Tuyển dụng và đào tạo </w:t>
+            </w:r>
+            <w:r>
+              <w:rPr>
+                <w:sz w:val="19"/>
+                <w:szCs w:val="19"/>
+              </w:rPr>
+              <w:t>hoàn tất</w:t>
             </w:r>
           </w:p>
         </w:tc>
@@ -11971,6 +11978,9 @@
         <w:jc w:val="center"/>
       </w:pPr>
       <w:r>
+        <w:rPr>
+          <w:noProof/>
+        </w:rPr>
         <w:drawing>
           <wp:inline distT="0" distB="0" distL="0" distR="0" wp14:anchorId="1EC259DE" wp14:editId="1568497D">
             <wp:extent cx="6188710" cy="1943735"/>
@@ -14772,6 +14782,9 @@
         <w:jc w:val="center"/>
       </w:pPr>
       <w:r>
+        <w:rPr>
+          <w:noProof/>
+        </w:rPr>
         <w:drawing>
           <wp:inline distT="0" distB="0" distL="0" distR="0" wp14:anchorId="1478C3FC" wp14:editId="3AE19E9F">
             <wp:extent cx="6188710" cy="1963420"/>
@@ -15517,6 +15530,9 @@
         <w:pStyle w:val="Heading3"/>
       </w:pPr>
       <w:r>
+        <w:rPr>
+          <w:noProof/>
+        </w:rPr>
         <w:lastRenderedPageBreak/>
         <w:drawing>
           <wp:inline distT="0" distB="0" distL="0" distR="0" wp14:anchorId="301F0ACA" wp14:editId="2314DC55">
@@ -17404,6 +17420,9 @@
         <w:spacing w:after="180" w:line="300" w:lineRule="auto"/>
       </w:pPr>
       <w:r>
+        <w:rPr>
+          <w:noProof/>
+        </w:rPr>
         <w:drawing>
           <wp:inline distT="0" distB="0" distL="0" distR="0" wp14:anchorId="3026FD58" wp14:editId="64CEEF22">
             <wp:extent cx="6188710" cy="1906270"/>

</xml_diff>